<commit_message>
EDIT: Correction ISN-->SN, Zurich Metadata 1950-->1959
</commit_message>
<xml_diff>
--- a/_site/Database.docx
+++ b/_site/Database.docx
@@ -41,13 +41,13 @@
         <w:pStyle w:val="FirstParagraph"/>
       </w:pPr>
       <w:r>
-        <w:t xml:space="preserve">The FARSuN historical sunspot database consolidates raw sunspot observations (1610–1980) from multiple legacy sources into a single, queryable system that follows Virtual Observatory (VO) standards. It harmonizes independent encodings (e.g., Mitteilungen, Wolf Institute tables, Shreya’s FARSuN DB, Stephen Fay’s variant) and augments them with observer/observatory/instrument metadata, provenance, and QC flags to support scientific reuse and the reconstruction of ISN V3. The core content is daily/group/spot counts (NG, NS, Wolf number components) with optional positions/areas where available, mapped to observers, observatories, instruments, and bibliographic rubrics (Mitteilungen IDs, pages/notes). It captures both table-based sources and drawing-derived extractions.</w:t>
-      </w:r>
-      <w:r>
-        <w:t xml:space="preserve"> </w:t>
-      </w:r>
-      <w:r>
-        <w:t xml:space="preserve">The database is the central integration layer: it makes disparate historical observations Findable, Accessible, Interoperable, and Reusable (FAIR) via standard VO tooling; enables consistent QC; and provides the authoritative input stream to ISN V3 stitching/calibration workflows. It also supports new products (e.g., GN; higher cadence daily numbers) by ensuring traceable, versioned provenance.</w:t>
+        <w:t xml:space="preserve">The FARSuN historical sunspot database consolidates raw sunspot observations (1610–1980) from multiple legacy sources into a single, queryable system that follows Virtual Observatory (VO) standards. It harmonizes independent encodings (e.g., Mitteilungen, Wolf Institute tables, Shreya’s FARSuN DB, Stephen Fay’s variant) and augments them with observer/observatory/instrument metadata, provenance, and QC flags to support scientific reuse and the reconstruction of the Sunspot Number (SN) V3. The core content is daily/group/spot counts (NG, NS, Wolf number components) with optional positions/areas where available, mapped to observers, observatories, instruments, and bibliographic rubrics (Mitteilungen IDs, pages/notes). It captures both table-based sources and drawing-derived extractions.</w:t>
+      </w:r>
+      <w:r>
+        <w:t xml:space="preserve"> </w:t>
+      </w:r>
+      <w:r>
+        <w:t xml:space="preserve">The database is the central integration layer: it makes disparate historical observations Findable, Accessible, Interoperable, and Reusable (FAIR) via standard VO tooling; enables consistent QC; and provides the authoritative input stream to SN V3 stitching/calibration workflows. It also supports new products (e.g., GN; higher cadence daily numbers) by ensuring traceable, versioned provenance.</w:t>
       </w:r>
     </w:p>
     <w:bookmarkStart w:id="20" w:name="X181b0eb7767c6c100e89a20bcf6c867db867caf"/>
@@ -80,7 +80,7 @@
         </w:numPr>
       </w:pPr>
       <w:r>
-        <w:t xml:space="preserve">Reconstruct ISN V3 with explicit provenance, uncertainty, and versioning.</w:t>
+        <w:t xml:space="preserve">Reconstruct SN V3 with explicit provenance, uncertainty, and versioning.</w:t>
       </w:r>
     </w:p>
     <w:p>
@@ -617,13 +617,13 @@
       </w:r>
     </w:p>
     <w:bookmarkEnd w:id="25"/>
-    <w:bookmarkStart w:id="26" w:name="roadmap-toward-isn-v3"/>
+    <w:bookmarkStart w:id="26" w:name="roadmap-toward-sn-v3"/>
     <w:p>
       <w:pPr>
         <w:pStyle w:val="Heading2"/>
       </w:pPr>
       <w:r>
-        <w:t xml:space="preserve">6 Roadmap toward ISN V3</w:t>
+        <w:t xml:space="preserve">6 Roadmap toward SN V3</w:t>
       </w:r>
     </w:p>
     <w:p>

</xml_diff>

<commit_message>
Publish latest rendered docs to docs/
</commit_message>
<xml_diff>
--- a/_site/Database.docx
+++ b/_site/Database.docx
@@ -41,22 +41,43 @@
         <w:pStyle w:val="FirstParagraph"/>
       </w:pPr>
       <w:r>
-        <w:t xml:space="preserve">The FARSuN historical sunspot database consolidates raw sunspot observations (1610–1980) from multiple legacy sources into a single, queryable system that follows Virtual Observatory (VO) standards. It harmonizes independent encodings (e.g., Mitteilungen, Wolf Institute tables, Shreya’s FARSuN DB, Stephen Fay’s variant) and augments them with observer/observatory/instrument metadata, provenance, and QC flags to support scientific reuse and the reconstruction of the Sunspot Number (SN) V3. The core content is daily/group/spot counts (NG, NS, Wolf number components) with optional positions/areas where available, mapped to observers, observatories, instruments, and bibliographic rubrics (Mitteilungen IDs, pages/notes). It captures both table-based sources and drawing-derived extractions.</w:t>
-      </w:r>
-      <w:r>
-        <w:t xml:space="preserve"> </w:t>
-      </w:r>
-      <w:r>
-        <w:t xml:space="preserve">The database is the central integration layer: it makes disparate historical observations Findable, Accessible, Interoperable, and Reusable (FAIR) via standard VO tooling; enables consistent QC; and provides the authoritative input stream to SN V3 stitching/calibration workflows. It also supports new products (e.g., GN; higher cadence daily numbers) by ensuring traceable, versioned provenance.</w:t>
+        <w:t xml:space="preserve">The FARSuN historical sunspot database consolidates raw sunspot observations (1610–1980) from multiple legacy sources into a single, queryable system that follows Virtual Observatory (VO) standards. It harmonizes independent encodings (e.g., Mitteilungen, Wolf Institute tables, Shreya’s FARSuN DB, Stephen Fay’s variant) and augments them with observer/observatory/instrument metadata, provenance, and QC flags to support scientific reuse and the reconstruction of the Sunspot Number (S</w:t>
+      </w:r>
+      <w:r>
+        <w:t xml:space="preserve">N</w:t>
+      </w:r>
+      <w:r>
+        <w:t xml:space="preserve">) V3. The core content is daily/group/spot counts (NG, NS, Wolf number components) with optional positions/areas where available, mapped to observers, observatories, instruments, and bibliographic rubrics (Mitteilungen IDs, pages/notes). It captures both table-based sources and drawing-derived extractions.</w:t>
+      </w:r>
+      <w:r>
+        <w:t xml:space="preserve"> </w:t>
+      </w:r>
+      <w:r>
+        <w:t xml:space="preserve">The database is the central integration layer: it makes disparate historical observations Findable, Accessible, Interoperable, and Reusable (FAIR) via standard VO tooling; enables consistent QC; and provides the authoritative input stream to S</w:t>
+      </w:r>
+      <w:r>
+        <w:t xml:space="preserve">N</w:t>
+      </w:r>
+      <w:r>
+        <w:t xml:space="preserve"> </w:t>
+      </w:r>
+      <w:r>
+        <w:t xml:space="preserve">V3 stitching/calibration workflows. It also supports new products (e.g., G</w:t>
+      </w:r>
+      <w:r>
+        <w:t xml:space="preserve">N</w:t>
+      </w:r>
+      <w:r>
+        <w:t xml:space="preserve">; higher cadence daily numbers) by ensuring traceable, versioned provenance.</w:t>
       </w:r>
     </w:p>
     <w:bookmarkStart w:id="20" w:name="X181b0eb7767c6c100e89a20bcf6c867db867caf"/>
     <w:p>
       <w:pPr>
-        <w:pStyle w:val="Heading3"/>
-      </w:pPr>
-      <w:r>
-        <w:t xml:space="preserve">0.1 A consolidated, QC’d, VO-exposed database is essential to:</w:t>
+        <w:pStyle w:val="Heading1"/>
+      </w:pPr>
+      <w:r>
+        <w:t xml:space="preserve">1. A consolidated, QC’d, VO-exposed database is essential to:</w:t>
       </w:r>
     </w:p>
     <w:p>
@@ -80,7 +101,16 @@
         </w:numPr>
       </w:pPr>
       <w:r>
-        <w:t xml:space="preserve">Reconstruct SN V3 with explicit provenance, uncertainty, and versioning.</w:t>
+        <w:t xml:space="preserve">Reconstruct S</w:t>
+      </w:r>
+      <w:r>
+        <w:t xml:space="preserve">N</w:t>
+      </w:r>
+      <w:r>
+        <w:t xml:space="preserve"> </w:t>
+      </w:r>
+      <w:r>
+        <w:t xml:space="preserve">V3 with explicit provenance, uncertainty, and versioning.</w:t>
       </w:r>
     </w:p>
     <w:p>
@@ -99,10 +129,10 @@
     <w:bookmarkStart w:id="21" w:name="what-the-data-look-like-schema-snapshot"/>
     <w:p>
       <w:pPr>
-        <w:pStyle w:val="Heading2"/>
-      </w:pPr>
-      <w:r>
-        <w:t xml:space="preserve">1 What the data look like (schema snapshot)</w:t>
+        <w:pStyle w:val="Heading1"/>
+      </w:pPr>
+      <w:r>
+        <w:t xml:space="preserve">2. What the data look like (schema snapshot)</w:t>
       </w:r>
     </w:p>
     <w:p>
@@ -296,10 +326,10 @@
     <w:bookmarkStart w:id="22" w:name="current-status-high-level"/>
     <w:p>
       <w:pPr>
-        <w:pStyle w:val="Heading2"/>
-      </w:pPr>
-      <w:r>
-        <w:t xml:space="preserve">2 Current status (high level)</w:t>
+        <w:pStyle w:val="Heading1"/>
+      </w:pPr>
+      <w:r>
+        <w:t xml:space="preserve">3. Current status (high level)</w:t>
       </w:r>
     </w:p>
     <w:p>
@@ -372,10 +402,10 @@
     <w:bookmarkStart w:id="23" w:name="quality-control-qc-highlights"/>
     <w:p>
       <w:pPr>
-        <w:pStyle w:val="Heading2"/>
-      </w:pPr>
-      <w:r>
-        <w:t xml:space="preserve">3 Quality control (QC) highlights</w:t>
+        <w:pStyle w:val="Heading1"/>
+      </w:pPr>
+      <w:r>
+        <w:t xml:space="preserve">4. Quality control (QC) highlights</w:t>
       </w:r>
     </w:p>
     <w:p>
@@ -482,10 +512,10 @@
     <w:bookmarkStart w:id="24" w:name="digitization-metadata"/>
     <w:p>
       <w:pPr>
-        <w:pStyle w:val="Heading2"/>
-      </w:pPr>
-      <w:r>
-        <w:t xml:space="preserve">4 Digitization &amp; metadata</w:t>
+        <w:pStyle w:val="Heading1"/>
+      </w:pPr>
+      <w:r>
+        <w:t xml:space="preserve">5. Digitization &amp; metadata</w:t>
       </w:r>
     </w:p>
     <w:p>
@@ -544,10 +574,10 @@
     <w:bookmarkStart w:id="25" w:name="accessibility"/>
     <w:p>
       <w:pPr>
-        <w:pStyle w:val="Heading2"/>
-      </w:pPr>
-      <w:r>
-        <w:t xml:space="preserve">5 Accessibility</w:t>
+        <w:pStyle w:val="Heading1"/>
+      </w:pPr>
+      <w:r>
+        <w:t xml:space="preserve">6. Accessibility</w:t>
       </w:r>
     </w:p>
     <w:p>
@@ -620,10 +650,16 @@
     <w:bookmarkStart w:id="26" w:name="roadmap-toward-sn-v3"/>
     <w:p>
       <w:pPr>
-        <w:pStyle w:val="Heading2"/>
-      </w:pPr>
-      <w:r>
-        <w:t xml:space="preserve">6 Roadmap toward SN V3</w:t>
+        <w:pStyle w:val="Heading1"/>
+      </w:pPr>
+      <w:r>
+        <w:t xml:space="preserve">7. Roadmap toward S</w:t>
+      </w:r>
+      <w:r>
+        <w:t xml:space="preserve">N</w:t>
+      </w:r>
+      <w:r>
+        <w:t xml:space="preserve"> V3</w:t>
       </w:r>
     </w:p>
     <w:p>
@@ -753,10 +789,10 @@
     <w:bookmarkStart w:id="27" w:name="risks-followups"/>
     <w:p>
       <w:pPr>
-        <w:pStyle w:val="Heading2"/>
-      </w:pPr>
-      <w:r>
-        <w:t xml:space="preserve">7 Risks &amp; follow‑ups</w:t>
+        <w:pStyle w:val="Heading1"/>
+      </w:pPr>
+      <w:r>
+        <w:t xml:space="preserve">8. Risks &amp; follow‑ups</w:t>
       </w:r>
     </w:p>
     <w:p>

</xml_diff>